<commit_message>
feat: use dynamically generated docx headers with centered company name and logo
</commit_message>
<xml_diff>
--- a/public/templates/Test ZNR.docx
+++ b/public/templates/Test ZNR.docx
@@ -5802,256 +5802,52 @@
 <w:hdr xmlns:wpc="http://schemas.microsoft.com/office/word/2010/wordprocessingCanvas" xmlns:cx="http://schemas.microsoft.com/office/drawing/2014/chartex" xmlns:cx1="http://schemas.microsoft.com/office/drawing/2015/9/8/chartex" xmlns:cx2="http://schemas.microsoft.com/office/drawing/2015/10/21/chartex" xmlns:cx3="http://schemas.microsoft.com/office/drawing/2016/5/9/chartex" xmlns:cx4="http://schemas.microsoft.com/office/drawing/2016/5/10/chartex" xmlns:cx5="http://schemas.microsoft.com/office/drawing/2016/5/11/chartex" xmlns:cx6="http://schemas.microsoft.com/office/drawing/2016/5/12/chartex" xmlns:cx7="http://schemas.microsoft.com/office/drawing/2016/5/13/chartex" xmlns:cx8="http://schemas.microsoft.com/office/drawing/2016/5/14/chartex" xmlns:mc="http://schemas.openxmlformats.org/markup-compatibility/2006" xmlns:aink="http://schemas.microsoft.com/office/drawing/2016/ink" xmlns:am3d="http://schemas.microsoft.com/office/drawing/2017/model3d" xmlns:o="urn:schemas-microsoft-com:office:office" xmlns:oel="http://schemas.microsoft.com/office/2019/extlst" xmlns:r="http://schemas.openxmlformats.org/officeDocument/2006/relationships" xmlns:m="http://schemas.openxmlformats.org/officeDocument/2006/math" xmlns:v="urn:schemas-microsoft-com:vml" xmlns:wp14="http://schemas.microsoft.com/office/word/2010/wordprocessingDrawing" xmlns:wp="http://schemas.openxmlformats.org/drawingml/2006/wordprocessingDrawing" xmlns:w10="urn:schemas-microsoft-com:office:word" xmlns:w="http://schemas.openxmlformats.org/wordprocessingml/2006/main" xmlns:w14="http://schemas.microsoft.com/office/word/2010/wordml" xmlns:w15="http://schemas.microsoft.com/office/word/2012/wordml" xmlns:w16cex="http://schemas.microsoft.com/office/word/2018/wordml/cex" xmlns:w16cid="http://schemas.microsoft.com/office/word/2016/wordml/cid" xmlns:w16="http://schemas.microsoft.com/office/word/2018/wordml" xmlns:w16du="http://schemas.microsoft.com/office/word/2023/wordml/word16du" xmlns:w16sdtdh="http://schemas.microsoft.com/office/word/2020/wordml/sdtdatahash" xmlns:w16sdtfl="http://schemas.microsoft.com/office/word/2024/wordml/sdtformatlock" xmlns:w16se="http://schemas.microsoft.com/office/word/2015/wordml/symex" xmlns:wpg="http://schemas.microsoft.com/office/word/2010/wordprocessingGroup" xmlns:wpi="http://schemas.microsoft.com/office/word/2010/wordprocessingInk" xmlns:wne="http://schemas.microsoft.com/office/word/2006/wordml" xmlns:wps="http://schemas.microsoft.com/office/word/2010/wordprocessingShape" mc:Ignorable="w14 w15 w16se w16cid w16 w16cex w16sdtdh w16sdtfl w16du wp14">
   <w:p>
     <w:pPr>
-      <w:pStyle w:val="Header"/>
+      <w:jc w:val="center"/>
     </w:pPr>
     <w:r>
-      <w:rPr>
-        <w:noProof/>
-      </w:rPr>
-      <mc:AlternateContent>
-        <mc:Choice Requires="wpg">
-          <w:drawing>
-            <wp:anchor distT="0" distB="0" distL="114300" distR="114300" simplePos="0" relativeHeight="251658243" behindDoc="0" locked="0" layoutInCell="1" allowOverlap="1" wp14:anchorId="04A738AA" wp14:editId="4541A463">
-              <wp:simplePos x="0" y="0"/>
-              <wp:positionH relativeFrom="column">
-                <wp:posOffset>186055</wp:posOffset>
-              </wp:positionH>
-              <wp:positionV relativeFrom="paragraph">
-                <wp:posOffset>88265</wp:posOffset>
-              </wp:positionV>
-              <wp:extent cx="5826858" cy="892810"/>
-              <wp:effectExtent l="0" t="0" r="2540" b="2540"/>
-              <wp:wrapNone/>
-              <wp:docPr id="498957278" name="Group 1"/>
-              <wp:cNvGraphicFramePr/>
-              <a:graphic xmlns:a="http://schemas.openxmlformats.org/drawingml/2006/main">
-                <a:graphicData uri="http://schemas.microsoft.com/office/word/2010/wordprocessingGroup">
-                  <wpg:wgp>
-                    <wpg:cNvGrpSpPr/>
-                    <wpg:grpSpPr>
-                      <a:xfrm>
-                        <a:off x="0" y="0"/>
-                        <a:ext cx="5826858" cy="892810"/>
-                        <a:chOff x="0" y="0"/>
-                        <a:chExt cx="5826858" cy="892810"/>
-                      </a:xfrm>
-                    </wpg:grpSpPr>
-                    <pic:pic xmlns:pic="http://schemas.openxmlformats.org/drawingml/2006/picture">
-                      <pic:nvPicPr>
-                        <pic:cNvPr id="652774540" name="Picture 1" descr="A blue and white circle with text&#10;&#10;Description automatically generated"/>
-                        <pic:cNvPicPr>
-                          <a:picLocks noChangeAspect="1"/>
-                        </pic:cNvPicPr>
-                      </pic:nvPicPr>
-                      <pic:blipFill>
-                        <a:blip r:embed="rId1">
-                          <a:extLst>
-                            <a:ext uri="{28A0092B-C50C-407E-A947-70E740481C1C}">
-                              <a14:useLocalDpi xmlns:a14="http://schemas.microsoft.com/office/drawing/2010/main" val="0"/>
-                            </a:ext>
-                          </a:extLst>
-                        </a:blip>
-                        <a:srcRect/>
-                        <a:stretch>
-                          <a:fillRect/>
-                        </a:stretch>
-                      </pic:blipFill>
-                      <pic:spPr bwMode="auto">
-                        <a:xfrm>
-                          <a:off x="5287108" y="191477"/>
-                          <a:ext cx="539750" cy="539750"/>
-                        </a:xfrm>
-                        <a:prstGeom prst="rect">
-                          <a:avLst/>
-                        </a:prstGeom>
-                        <a:noFill/>
-                        <a:ln>
-                          <a:noFill/>
-                        </a:ln>
-                      </pic:spPr>
-                    </pic:pic>
-                    <pic:pic xmlns:pic="http://schemas.openxmlformats.org/drawingml/2006/picture">
-                      <pic:nvPicPr>
-                        <pic:cNvPr id="848596550" name="Picture 3" descr="Logo&#10;&#10;Description automatically generated"/>
-                        <pic:cNvPicPr>
-                          <a:picLocks noChangeAspect="1"/>
-                        </pic:cNvPicPr>
-                      </pic:nvPicPr>
-                      <pic:blipFill>
-                        <a:blip r:embed="rId2" cstate="print">
-                          <a:alphaModFix amt="85000"/>
-                          <a:extLst>
-                            <a:ext uri="{28A0092B-C50C-407E-A947-70E740481C1C}">
-                              <a14:useLocalDpi xmlns:a14="http://schemas.microsoft.com/office/drawing/2010/main" val="0"/>
-                            </a:ext>
-                          </a:extLst>
-                        </a:blip>
-                        <a:srcRect/>
-                        <a:stretch>
-                          <a:fillRect/>
-                        </a:stretch>
-                      </pic:blipFill>
-                      <pic:spPr bwMode="auto">
-                        <a:xfrm>
-                          <a:off x="0" y="0"/>
-                          <a:ext cx="1298575" cy="892810"/>
-                        </a:xfrm>
-                        <a:prstGeom prst="rect">
-                          <a:avLst/>
-                        </a:prstGeom>
-                        <a:noFill/>
-                        <a:ln>
-                          <a:noFill/>
-                        </a:ln>
-                      </pic:spPr>
-                    </pic:pic>
-                    <pic:pic xmlns:pic="http://schemas.openxmlformats.org/drawingml/2006/picture">
-                      <pic:nvPicPr>
-                        <pic:cNvPr id="1257095690" name="Picture 4" descr="A blue and white logo&#10;&#10;Description automatically generated"/>
-                        <pic:cNvPicPr>
-                          <a:picLocks noChangeAspect="1"/>
-                        </pic:cNvPicPr>
-                      </pic:nvPicPr>
-                      <pic:blipFill>
-                        <a:blip r:embed="rId3">
-                          <a:extLst>
-                            <a:ext uri="{28A0092B-C50C-407E-A947-70E740481C1C}">
-                              <a14:useLocalDpi xmlns:a14="http://schemas.microsoft.com/office/drawing/2010/main" val="0"/>
-                            </a:ext>
-                          </a:extLst>
-                        </a:blip>
-                        <a:srcRect/>
-                        <a:stretch>
-                          <a:fillRect/>
-                        </a:stretch>
-                      </pic:blipFill>
-                      <pic:spPr bwMode="auto">
-                        <a:xfrm>
-                          <a:off x="4700954" y="191477"/>
-                          <a:ext cx="539750" cy="539750"/>
-                        </a:xfrm>
-                        <a:prstGeom prst="rect">
-                          <a:avLst/>
-                        </a:prstGeom>
-                        <a:noFill/>
-                        <a:ln>
-                          <a:noFill/>
-                        </a:ln>
-                      </pic:spPr>
-                    </pic:pic>
-                    <pic:pic xmlns:pic="http://schemas.openxmlformats.org/drawingml/2006/picture">
-                      <pic:nvPicPr>
-                        <pic:cNvPr id="1201808565" name="Picture 476716147" descr="45001"/>
-                        <pic:cNvPicPr>
-                          <a:picLocks noChangeAspect="1"/>
-                        </pic:cNvPicPr>
-                      </pic:nvPicPr>
-                      <pic:blipFill rotWithShape="1">
-                        <a:blip r:embed="rId4" cstate="print">
-                          <a:extLst>
-                            <a:ext uri="{28A0092B-C50C-407E-A947-70E740481C1C}">
-                              <a14:useLocalDpi xmlns:a14="http://schemas.microsoft.com/office/drawing/2010/main" val="0"/>
-                            </a:ext>
-                          </a:extLst>
-                        </a:blip>
-                        <a:srcRect l="-1" r="2621"/>
-                        <a:stretch>
-                          <a:fillRect/>
-                        </a:stretch>
-                      </pic:blipFill>
-                      <pic:spPr bwMode="auto">
-                        <a:xfrm>
-                          <a:off x="4103077" y="179754"/>
-                          <a:ext cx="560070" cy="563880"/>
-                        </a:xfrm>
-                        <a:prstGeom prst="rect">
-                          <a:avLst/>
-                        </a:prstGeom>
-                        <a:noFill/>
-                        <a:ln>
-                          <a:noFill/>
-                        </a:ln>
-                        <a:extLst>
-                          <a:ext uri="{53640926-AAD7-44D8-BBD7-CCE9431645EC}">
-                            <a14:shadowObscured xmlns:a14="http://schemas.microsoft.com/office/drawing/2010/main"/>
-                          </a:ext>
-                        </a:extLst>
-                      </pic:spPr>
-                    </pic:pic>
-                  </wpg:wgp>
-                </a:graphicData>
-              </a:graphic>
-            </wp:anchor>
-          </w:drawing>
-        </mc:Choice>
-        <mc:Fallback>
-          <w:pict>
-            <v:group w14:anchorId="0150DDFF" id="Group 1" o:spid="_x0000_s1026" style="position:absolute;margin-left:14.65pt;margin-top:6.95pt;width:458.8pt;height:70.3pt;z-index:251660291" coordsize="58268,8928" o:gfxdata="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">
-              <v:shapetype id="_x0000_t75" coordsize="21600,21600" o:spt="75" o:preferrelative="t" path="m@4@5l@4@11@9@11@9@5xe" filled="f" stroked="f">
-                <v:stroke joinstyle="miter"/>
-                <v:formulas>
-                  <v:f eqn="if lineDrawn pixelLineWidth 0"/>
-                  <v:f eqn="sum @0 1 0"/>
-                  <v:f eqn="sum 0 0 @1"/>
-                  <v:f eqn="prod @2 1 2"/>
-                  <v:f eqn="prod @3 21600 pixelWidth"/>
-                  <v:f eqn="prod @3 21600 pixelHeight"/>
-                  <v:f eqn="sum @0 0 1"/>
-                  <v:f eqn="prod @6 1 2"/>
-                  <v:f eqn="prod @7 21600 pixelWidth"/>
-                  <v:f eqn="sum @8 21600 0"/>
-                  <v:f eqn="prod @7 21600 pixelHeight"/>
-                  <v:f eqn="sum @10 21600 0"/>
-                </v:formulas>
-                <v:path o:extrusionok="f" gradientshapeok="t" o:connecttype="rect"/>
-                <o:lock v:ext="edit" aspectratio="t"/>
-              </v:shapetype>
-              <v:shape id="Picture 1" o:spid="_x0000_s1027" type="#_x0000_t75" alt="A blue and white circle with text&#10;&#10;Description automatically generated" style="position:absolute;left:52871;top:1914;width:5397;height:5398;visibility:visible;mso-wrap-style:square" o:gfxdata="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">
-                <v:imagedata r:id="rId5" o:title="A blue and white circle with text&#10;&#10;Description automatically generated"/>
-              </v:shape>
-              <v:shape id="Picture 3" o:spid="_x0000_s1028" type="#_x0000_t75" alt="Logo&#10;&#10;Description automatically generated" style="position:absolute;width:12985;height:8928;visibility:visible;mso-wrap-style:square" o:gfxdata="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">
-                <v:imagedata r:id="rId6" o:title="Logo&#10;&#10;Description automatically generated"/>
-              </v:shape>
-              <v:shape id="Picture 4" o:spid="_x0000_s1029" type="#_x0000_t75" alt="A blue and white logo&#10;&#10;Description automatically generated" style="position:absolute;left:47009;top:1914;width:5398;height:5398;visibility:visible;mso-wrap-style:square" o:gfxdata="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">
-                <v:imagedata r:id="rId7" o:title="A blue and white logo&#10;&#10;Description automatically generated"/>
-              </v:shape>
-              <v:shape id="Picture 476716147" o:spid="_x0000_s1030" type="#_x0000_t75" alt="45001" style="position:absolute;left:41030;top:1797;width:5601;height:5639;visibility:visible;mso-wrap-style:square" o:gfxdata="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">
-                <v:imagedata r:id="rId8" o:title="45001" cropleft="-1f" cropright="1718f"/>
-              </v:shape>
-            </v:group>
-          </w:pict>
-        </mc:Fallback>
-      </mc:AlternateContent>
+      <w:drawing>
+        <wp:inline xmlns:a="http://schemas.openxmlformats.org/drawingml/2006/main" xmlns:pic="http://schemas.openxmlformats.org/drawingml/2006/picture">
+          <wp:extent cx="1097280" cy="548640"/>
+          <wp:docPr id="1" name="Picture 1"/>
+          <wp:cNvGraphicFramePr>
+            <a:graphicFrameLocks noChangeAspect="1"/>
+          </wp:cNvGraphicFramePr>
+          <a:graphic>
+            <a:graphicData uri="http://schemas.openxmlformats.org/drawingml/2006/picture">
+              <pic:pic>
+                <pic:nvPicPr>
+                  <pic:cNvPr id="0" name="dummy.png"/>
+                  <pic:cNvPicPr/>
+                </pic:nvPicPr>
+                <pic:blipFill>
+                  <a:blip r:embed="rId10"/>
+                  <a:stretch>
+                    <a:fillRect/>
+                  </a:stretch>
+                </pic:blipFill>
+                <pic:spPr>
+                  <a:xfrm>
+                    <a:off x="0" y="0"/>
+                    <a:ext cx="1097280" cy="548640"/>
+                  </a:xfrm>
+                  <a:prstGeom prst="rect"/>
+                </pic:spPr>
+              </pic:pic>
+            </a:graphicData>
+          </a:graphic>
+        </wp:inline>
+      </w:drawing>
+    </w:r>
+    <w:r>
+      <w:t xml:space="preserve">   </w:t>
     </w:r>
     <w:r>
       <w:rPr>
-        <w:noProof/>
+        <w:rFonts w:ascii="Arial" w:hAnsi="Arial"/>
+        <w:b/>
+        <w:sz w:val="28"/>
       </w:rPr>
-      <w:pict w14:anchorId="2A17CDF3">
-        <v:shapetype id="_x0000_t75" coordsize="21600,21600" o:spt="75" o:preferrelative="t" path="m@4@5l@4@11@9@11@9@5xe" filled="f" stroked="f">
-          <v:stroke joinstyle="miter"/>
-          <v:formulas>
-            <v:f eqn="if lineDrawn pixelLineWidth 0"/>
-            <v:f eqn="sum @0 1 0"/>
-            <v:f eqn="sum 0 0 @1"/>
-            <v:f eqn="prod @2 1 2"/>
-            <v:f eqn="prod @3 21600 pixelWidth"/>
-            <v:f eqn="prod @3 21600 pixelHeight"/>
-            <v:f eqn="sum @0 0 1"/>
-            <v:f eqn="prod @6 1 2"/>
-            <v:f eqn="prod @7 21600 pixelWidth"/>
-            <v:f eqn="sum @8 21600 0"/>
-            <v:f eqn="prod @7 21600 pixelHeight"/>
-            <v:f eqn="sum @10 21600 0"/>
-          </v:formulas>
-          <v:path o:extrusionok="f" gradientshapeok="t" o:connecttype="rect"/>
-          <o:lock v:ext="edit" aspectratio="t"/>
-        </v:shapetype>
-        <v:shape id="WordPictureWatermark954340752" o:spid="_x0000_s1044" type="#_x0000_t75" style="position:absolute;margin-left:0;margin-top:0;width:840pt;height:859pt;z-index:-251658238;mso-position-horizontal:center;mso-position-horizontal-relative:margin;mso-position-vertical:center;mso-position-vertical-relative:margin" o:allowincell="f">
-          <v:imagedata r:id="rId9" o:title="home-fire-icon-trans nadzina vatrica" gain="19661f" blacklevel="22938f"/>
-          <w10:wrap anchorx="margin" anchory="margin"/>
-        </v:shape>
-      </w:pict>
+      <w:t>{{COMPANY_NAME}}</w:t>
     </w:r>
   </w:p>
 </w:hdr>

</xml_diff>